<commit_message>
Make clause (13)'s renewal fee wording editable, default to original phrase
The Malayalam rental template hardcoded "കാലാനുസൃതമായ" (a customary/
prevailing-rate fee increase) into clause 13's renewal language. Turns
it into a renewal_fee_increase_terms staff_field, same pattern as
fee_due_day: not asked of the customer, pre-filled with that same
wording on the review dashboard so the clause reads unchanged by
default, editable there when an agreement needs a specific rate/term
instead (e.g. "10%").

Co-Authored-By: Claude Sonnet 5 <noreply@anthropic.com>
Claude-Session: https://claude.ai/code/session_01UsmiswDXojJNKfThx4Xowo
</commit_message>
<xml_diff>
--- a/templates_docx/rental_agreement_ml.docx
+++ b/templates_docx/rental_agreement_ml.docx
@@ -15142,84 +15142,74 @@
           <w:rFonts w:ascii="Nirmala UI" w:eastAsia="Noto Sans Malayalam" w:hAnsi="Nirmala UI" w:cs="Nirmala UI"/>
           <w:lang w:val="en-US"/>
         </w:rPr>
-        <w:t>കാലാ</w:t>
-      </w:r>
-      <w:proofErr w:type="spellEnd"/>
-      <w:r>
-        <w:rPr>
-          <w:rFonts w:ascii="ML-TTRevathi" w:eastAsia="Noto Sans Malayalam" w:hAnsi="ML-TTRevathi" w:cs="Noto Sans Malayalam"/>
-          <w:lang w:val="en-US"/>
-        </w:rPr>
-        <w:t>-</w:t>
-      </w:r>
-      <w:proofErr w:type="spellStart"/>
-      <w:r>
-        <w:rPr>
-          <w:rFonts w:ascii="Nirmala UI" w:eastAsia="Noto Sans Malayalam" w:hAnsi="Nirmala UI" w:cs="Nirmala UI"/>
-          <w:lang w:val="en-US"/>
-        </w:rPr>
-        <w:t>നു</w:t>
-      </w:r>
-      <w:proofErr w:type="spellEnd"/>
-      <w:r>
-        <w:rPr>
-          <w:rFonts w:ascii="ML-TTRevathi" w:eastAsia="Noto Sans Malayalam" w:hAnsi="ML-TTRevathi" w:cs="Noto Sans Malayalam"/>
-          <w:lang w:val="en-US"/>
-        </w:rPr>
-        <w:t>-</w:t>
-      </w:r>
-      <w:proofErr w:type="spellStart"/>
-      <w:r>
-        <w:rPr>
-          <w:rFonts w:ascii="Nirmala UI" w:eastAsia="Noto Sans Malayalam" w:hAnsi="Nirmala UI" w:cs="Nirmala UI"/>
-          <w:lang w:val="en-US"/>
-        </w:rPr>
-        <w:t>സൃ</w:t>
-      </w:r>
-      <w:proofErr w:type="spellEnd"/>
-      <w:r>
-        <w:rPr>
-          <w:rFonts w:ascii="ML-TTRevathi" w:eastAsia="Noto Sans Malayalam" w:hAnsi="ML-TTRevathi" w:cs="Noto Sans Malayalam"/>
-          <w:lang w:val="en-US"/>
-        </w:rPr>
-        <w:t>-</w:t>
-      </w:r>
-      <w:r>
-        <w:rPr>
-          <w:rFonts w:ascii="Nirmala UI" w:eastAsia="Noto Sans Malayalam" w:hAnsi="Nirmala UI" w:cs="Nirmala UI"/>
-          <w:lang w:val="en-US"/>
-        </w:rPr>
-        <w:t>ത</w:t>
-      </w:r>
-      <w:r>
-        <w:rPr>
-          <w:rFonts w:ascii="ML-TTRevathi" w:eastAsia="Noto Sans Malayalam" w:hAnsi="ML-TTRevathi" w:cs="Noto Sans Malayalam"/>
-          <w:lang w:val="en-US"/>
-        </w:rPr>
-        <w:t>-</w:t>
-      </w:r>
-      <w:proofErr w:type="spellStart"/>
-      <w:r>
-        <w:rPr>
-          <w:rFonts w:ascii="Nirmala UI" w:eastAsia="Noto Sans Malayalam" w:hAnsi="Nirmala UI" w:cs="Nirmala UI"/>
-          <w:lang w:val="en-US"/>
-        </w:rPr>
-        <w:t>മാ</w:t>
-      </w:r>
-      <w:proofErr w:type="spellEnd"/>
-      <w:r>
-        <w:rPr>
-          <w:rFonts w:ascii="ML-TTRevathi" w:eastAsia="Noto Sans Malayalam" w:hAnsi="ML-TTRevathi" w:cs="Noto Sans Malayalam"/>
-          <w:lang w:val="en-US"/>
-        </w:rPr>
-        <w:t>-</w:t>
-      </w:r>
-      <w:r>
-        <w:rPr>
-          <w:rFonts w:ascii="Nirmala UI" w:eastAsia="Noto Sans Malayalam" w:hAnsi="Nirmala UI" w:cs="Nirmala UI"/>
-          <w:lang w:val="en-US"/>
-        </w:rPr>
-        <w:t>യ</w:t>
+        <w:t>{{ renewal_fee_increase_terms }}</w:t>
+      </w:r>
+      <w:proofErr w:type="spellEnd"/>
+      <w:r>
+        <w:rPr>
+          <w:rFonts w:ascii="ML-TTRevathi" w:eastAsia="Noto Sans Malayalam" w:hAnsi="ML-TTRevathi" w:cs="Noto Sans Malayalam"/>
+          <w:lang w:val="en-US"/>
+        </w:rPr>
+      </w:r>
+      <w:proofErr w:type="spellStart"/>
+      <w:r>
+        <w:rPr>
+          <w:rFonts w:ascii="Nirmala UI" w:eastAsia="Noto Sans Malayalam" w:hAnsi="Nirmala UI" w:cs="Nirmala UI"/>
+          <w:lang w:val="en-US"/>
+        </w:rPr>
+      </w:r>
+      <w:proofErr w:type="spellEnd"/>
+      <w:r>
+        <w:rPr>
+          <w:rFonts w:ascii="ML-TTRevathi" w:eastAsia="Noto Sans Malayalam" w:hAnsi="ML-TTRevathi" w:cs="Noto Sans Malayalam"/>
+          <w:lang w:val="en-US"/>
+        </w:rPr>
+      </w:r>
+      <w:proofErr w:type="spellStart"/>
+      <w:r>
+        <w:rPr>
+          <w:rFonts w:ascii="Nirmala UI" w:eastAsia="Noto Sans Malayalam" w:hAnsi="Nirmala UI" w:cs="Nirmala UI"/>
+          <w:lang w:val="en-US"/>
+        </w:rPr>
+      </w:r>
+      <w:proofErr w:type="spellEnd"/>
+      <w:r>
+        <w:rPr>
+          <w:rFonts w:ascii="ML-TTRevathi" w:eastAsia="Noto Sans Malayalam" w:hAnsi="ML-TTRevathi" w:cs="Noto Sans Malayalam"/>
+          <w:lang w:val="en-US"/>
+        </w:rPr>
+      </w:r>
+      <w:r>
+        <w:rPr>
+          <w:rFonts w:ascii="Nirmala UI" w:eastAsia="Noto Sans Malayalam" w:hAnsi="Nirmala UI" w:cs="Nirmala UI"/>
+          <w:lang w:val="en-US"/>
+        </w:rPr>
+      </w:r>
+      <w:r>
+        <w:rPr>
+          <w:rFonts w:ascii="ML-TTRevathi" w:eastAsia="Noto Sans Malayalam" w:hAnsi="ML-TTRevathi" w:cs="Noto Sans Malayalam"/>
+          <w:lang w:val="en-US"/>
+        </w:rPr>
+      </w:r>
+      <w:proofErr w:type="spellStart"/>
+      <w:r>
+        <w:rPr>
+          <w:rFonts w:ascii="Nirmala UI" w:eastAsia="Noto Sans Malayalam" w:hAnsi="Nirmala UI" w:cs="Nirmala UI"/>
+          <w:lang w:val="en-US"/>
+        </w:rPr>
+      </w:r>
+      <w:proofErr w:type="spellEnd"/>
+      <w:r>
+        <w:rPr>
+          <w:rFonts w:ascii="ML-TTRevathi" w:eastAsia="Noto Sans Malayalam" w:hAnsi="ML-TTRevathi" w:cs="Noto Sans Malayalam"/>
+          <w:lang w:val="en-US"/>
+        </w:rPr>
+      </w:r>
+      <w:r>
+        <w:rPr>
+          <w:rFonts w:ascii="Nirmala UI" w:eastAsia="Noto Sans Malayalam" w:hAnsi="Nirmala UI" w:cs="Nirmala UI"/>
+          <w:lang w:val="en-US"/>
+        </w:rPr>
       </w:r>
       <w:r>
         <w:rPr>

</xml_diff>

<commit_message>
Fix clause (1) not reflecting a changed agreement_duration_months
Clause (1) -- the opening license grant sentence -- hardcoded the
duration as the literal word "പതിനൊന്ന്" (eleven) instead of using a
placeholder, so it stayed stuck at 11 months no matter what staff set
agreement_duration_months to on the review dashboard, even though
every other clause referencing duration already used a placeholder
and updated correctly. Replaced it with
{{ agreement_duration_months_words_ml }}, the same Malayalam
word-form context variable already used elsewhere in the document.

Verified with test renders at duration=11 and duration=36 -- clause
(1) now tracks the actual value in both cases.

Co-Authored-By: Claude Sonnet 5 <noreply@anthropic.com>
Claude-Session: https://claude.ai/code/session_01UsmiswDXojJNKfThx4Xowo
</commit_message>
<xml_diff>
--- a/templates_docx/rental_agreement_ml.docx
+++ b/templates_docx/rental_agreement_ml.docx
@@ -3360,19 +3360,17 @@
         <w:rPr>
           <w:rFonts w:ascii="Nirmala UI" w:eastAsia="Noto Sans Malayalam" w:hAnsi="Nirmala UI" w:cs="Nirmala UI"/>
         </w:rPr>
-        <w:t>പതി</w:t>
-      </w:r>
-      <w:r>
-        <w:rPr>
-          <w:rFonts w:ascii="ML-TTRevathi" w:eastAsia="Noto Sans Malayalam" w:hAnsi="ML-TTRevathi" w:cs="Noto Sans Malayalam"/>
-        </w:rPr>
-        <w:t>-</w:t>
-      </w:r>
-      <w:r>
-        <w:rPr>
-          <w:rFonts w:ascii="Nirmala UI" w:eastAsia="Noto Sans Malayalam" w:hAnsi="Nirmala UI" w:cs="Nirmala UI"/>
-        </w:rPr>
-        <w:t>നൊന്ന്</w:t>
+        <w:t>{{ agreement_duration_months_words_ml }}</w:t>
+      </w:r>
+      <w:r>
+        <w:rPr>
+          <w:rFonts w:ascii="ML-TTRevathi" w:eastAsia="Noto Sans Malayalam" w:hAnsi="ML-TTRevathi" w:cs="Noto Sans Malayalam"/>
+        </w:rPr>
+      </w:r>
+      <w:r>
+        <w:rPr>
+          <w:rFonts w:ascii="Nirmala UI" w:eastAsia="Noto Sans Malayalam" w:hAnsi="Nirmala UI" w:cs="Nirmala UI"/>
+        </w:rPr>
       </w:r>
       <w:proofErr w:type="spellEnd"/>
       <w:r>

</xml_diff>